<commit_message>
nmv 28 06 2026
</commit_message>
<xml_diff>
--- a/TS Jatai Ghanam Project/TS 1.3/TS 1.3 Jatai Malayalam Corrections.docx
+++ b/TS Jatai Ghanam Project/TS 1.3/TS 1.3 Jatai Malayalam Corrections.docx
@@ -30,10 +30,9 @@
           <w:bCs/>
           <w:sz w:val="32"/>
           <w:szCs w:val="32"/>
-          <w:highlight w:val="red"/>
           <w:u w:val="single"/>
         </w:rPr>
-        <w:t>????</w:t>
+        <w:t>30th June 2026</w:t>
       </w:r>
     </w:p>
     <w:p>
@@ -569,6 +568,29 @@
         </w:tc>
       </w:tr>
     </w:tbl>
+    <w:p>
+      <w:pPr>
+        <w:spacing w:before="0" w:line="240" w:lineRule="auto"/>
+        <w:jc w:val="center"/>
+        <w:rPr>
+          <w:b/>
+          <w:bCs/>
+          <w:sz w:val="32"/>
+          <w:szCs w:val="32"/>
+          <w:u w:val="single"/>
+        </w:rPr>
+      </w:pPr>
+      <w:r>
+        <w:rPr>
+          <w:b/>
+          <w:bCs/>
+          <w:sz w:val="32"/>
+          <w:szCs w:val="32"/>
+          <w:u w:val="single"/>
+        </w:rPr>
+        <w:t>========</w:t>
+      </w:r>
+    </w:p>
     <w:p>
       <w:pPr>
         <w:spacing w:before="0" w:line="240" w:lineRule="auto"/>
@@ -1912,6 +1934,7 @@
                 <w:sz w:val="28"/>
                 <w:szCs w:val="40"/>
               </w:rPr>
+              <w:lastRenderedPageBreak/>
               <w:t>21</w:t>
             </w:r>
             <w:r>
@@ -2054,7 +2077,6 @@
                 <w:sz w:val="36"/>
                 <w:szCs w:val="40"/>
               </w:rPr>
-              <w:lastRenderedPageBreak/>
               <w:t>Akx</w:t>
             </w:r>
             <w:r>
@@ -2220,7 +2242,6 @@
                 <w:sz w:val="28"/>
                 <w:szCs w:val="40"/>
               </w:rPr>
-              <w:lastRenderedPageBreak/>
               <w:t>21</w:t>
             </w:r>
             <w:r>
@@ -2363,7 +2384,6 @@
                 <w:sz w:val="36"/>
                 <w:szCs w:val="40"/>
               </w:rPr>
-              <w:lastRenderedPageBreak/>
               <w:t>Akx—</w:t>
             </w:r>
             <w:r>
@@ -2516,7 +2536,6 @@
                 <w:sz w:val="28"/>
                 <w:szCs w:val="40"/>
               </w:rPr>
-              <w:lastRenderedPageBreak/>
               <w:t>74</w:t>
             </w:r>
             <w:r>
@@ -4381,6 +4400,7 @@
                 <w:sz w:val="28"/>
                 <w:szCs w:val="40"/>
               </w:rPr>
+              <w:lastRenderedPageBreak/>
               <w:t>26</w:t>
             </w:r>
             <w:r>
@@ -4494,7 +4514,6 @@
                 <w:sz w:val="36"/>
                 <w:szCs w:val="40"/>
               </w:rPr>
-              <w:lastRenderedPageBreak/>
               <w:t>s¥</w:t>
             </w:r>
             <w:bookmarkStart w:id="0" w:name="_Hlk120378363"/>
@@ -4573,7 +4592,6 @@
                 <w:sz w:val="28"/>
                 <w:szCs w:val="40"/>
               </w:rPr>
-              <w:lastRenderedPageBreak/>
               <w:t>26</w:t>
             </w:r>
             <w:r>
@@ -4705,7 +4723,6 @@
                 <w:sz w:val="36"/>
                 <w:szCs w:val="40"/>
               </w:rPr>
-              <w:lastRenderedPageBreak/>
               <w:t>s¥LZy</w:t>
             </w:r>
             <w:r>
@@ -4771,7 +4788,6 @@
                 <w:sz w:val="28"/>
                 <w:szCs w:val="40"/>
               </w:rPr>
-              <w:lastRenderedPageBreak/>
               <w:t>39</w:t>
             </w:r>
             <w:r>
@@ -6559,6 +6575,7 @@
                 <w:sz w:val="36"/>
                 <w:szCs w:val="40"/>
               </w:rPr>
+              <w:lastRenderedPageBreak/>
               <w:t>ki—Æû i</w:t>
             </w:r>
             <w:r>
@@ -6696,6 +6713,7 @@
                 <w:sz w:val="28"/>
                 <w:szCs w:val="40"/>
               </w:rPr>
+              <w:lastRenderedPageBreak/>
               <w:t>24</w:t>
             </w:r>
             <w:r>
@@ -7344,6 +7362,7 @@
                 <w:sz w:val="36"/>
                 <w:szCs w:val="40"/>
               </w:rPr>
+              <w:lastRenderedPageBreak/>
               <w:t>ki—Æû i</w:t>
             </w:r>
             <w:r>
@@ -9824,6 +9843,7 @@
                 <w:sz w:val="36"/>
                 <w:szCs w:val="40"/>
               </w:rPr>
+              <w:lastRenderedPageBreak/>
               <w:t>Hxr—czhõ</w:t>
             </w:r>
             <w:r>
@@ -9900,6 +9920,7 @@
                 <w:sz w:val="28"/>
                 <w:szCs w:val="40"/>
               </w:rPr>
+              <w:lastRenderedPageBreak/>
               <w:t>3</w:t>
             </w:r>
             <w:r>
@@ -10013,6 +10034,7 @@
                 <w:sz w:val="36"/>
                 <w:szCs w:val="40"/>
               </w:rPr>
+              <w:lastRenderedPageBreak/>
               <w:t>Hxr—czhõ</w:t>
             </w:r>
             <w:r>
@@ -10105,7 +10127,6 @@
                 <w:sz w:val="28"/>
                 <w:szCs w:val="40"/>
               </w:rPr>
-              <w:lastRenderedPageBreak/>
               <w:t>16</w:t>
             </w:r>
             <w:r>
@@ -10433,7 +10454,6 @@
                 <w:sz w:val="28"/>
                 <w:szCs w:val="40"/>
               </w:rPr>
-              <w:lastRenderedPageBreak/>
               <w:t>16</w:t>
             </w:r>
             <w:r>
@@ -12751,6 +12771,7 @@
                 <w:sz w:val="28"/>
                 <w:szCs w:val="40"/>
               </w:rPr>
+              <w:lastRenderedPageBreak/>
               <w:t>12</w:t>
             </w:r>
             <w:r>
@@ -13102,7 +13123,6 @@
                 <w:sz w:val="28"/>
                 <w:szCs w:val="40"/>
               </w:rPr>
-              <w:lastRenderedPageBreak/>
               <w:t>38</w:t>
             </w:r>
             <w:r>
@@ -15138,6 +15158,7 @@
                 <w:sz w:val="36"/>
                 <w:szCs w:val="40"/>
               </w:rPr>
+              <w:lastRenderedPageBreak/>
               <w:t>së</w:t>
             </w:r>
             <w:r>
@@ -15337,7 +15358,6 @@
                 <w:sz w:val="36"/>
                 <w:szCs w:val="40"/>
               </w:rPr>
-              <w:lastRenderedPageBreak/>
               <w:t>së</w:t>
             </w:r>
             <w:r>
@@ -15692,6 +15712,7 @@
                 <w:sz w:val="36"/>
                 <w:szCs w:val="40"/>
               </w:rPr>
+              <w:lastRenderedPageBreak/>
               <w:t>së</w:t>
             </w:r>
             <w:r>
@@ -15888,7 +15909,6 @@
                 <w:sz w:val="36"/>
                 <w:szCs w:val="40"/>
               </w:rPr>
-              <w:lastRenderedPageBreak/>
               <w:t>së</w:t>
             </w:r>
             <w:r>
@@ -18331,6 +18351,7 @@
           <w:szCs w:val="32"/>
           <w:u w:val="single"/>
         </w:rPr>
+        <w:lastRenderedPageBreak/>
         <w:t xml:space="preserve">TS </w:t>
       </w:r>
       <w:r>
@@ -18505,7 +18526,6 @@
                 <w:sz w:val="32"/>
                 <w:szCs w:val="32"/>
               </w:rPr>
-              <w:lastRenderedPageBreak/>
               <w:t>Section, Paragraph</w:t>
             </w:r>
           </w:p>

</xml_diff>